<commit_message>
Partie IV : enrichissement du cycle du medicament depuis la fiche LEEM (ANSM/UE, selectivite 10000-10-1, durees) + source LEEM
Co-Authored-By: Claude Opus 4.8 <noreply@anthropic.com>
Claude-Session: https://claude.ai/code/session_01DtHWGYnwsC4wUeLa1orSAR
</commit_message>
<xml_diff>
--- a/Rapport_de_stage_Luisa_Guissassa_corrige.docx
+++ b/Rapport_de_stage_Luisa_Guissassa_corrige.docx
@@ -1658,6 +1658,40 @@
     </w:p>
     <w:p>
       <w:pPr>
+        <w:ind w:left="720"/>
+        <w:rPr>
+          <w:color w:val="auto"/>
+          <w:lang w:val="fr-FR"/>
+        </w:rPr>
+      </w:pPr>
+      <w:r>
+        <w:rPr>
+          <w:color w:val="auto"/>
+          <w:lang w:val="fr-FR"/>
+        </w:rPr>
+        <w:t>Le médicament est d’ailleurs l’un des produits les plus encadrés qui soient : chaque étape, de la recherche à la commercialisation, obéit à une réglementation stricte, contrôlée en France par l’ANSM (Agence nationale de sécurité du médicament et des produits de santé), dans un cadre de plus en plus européen. Ce parcours est aussi très sélectif : sur environ 10 000 molécules ciblées au départ, une dizaine seulement deviennent des candidats médicaments, et une seule aboutit à un médicament commercialisé. Il s’étale enfin sur de longues années — souvent 8 à 10 ans de recherche et développement, auxquels s’ajoutent 1 à 3 ans pour les autorisations et la production.</w:t>
+      </w:r>
+      <w:r>
+        <w:rPr>
+          <w:color w:val="auto"/>
+          <w:lang w:val="fr-FR"/>
+        </w:rPr>
+      </w:r>
+      <w:r>
+        <w:rPr>
+          <w:color w:val="auto"/>
+          <w:lang w:val="fr-FR"/>
+        </w:rPr>
+      </w:r>
+      <w:r>
+        <w:rPr>
+          <w:color w:val="auto"/>
+          <w:lang w:val="fr-FR"/>
+        </w:rPr>
+      </w:r>
+    </w:p>
+    <w:p>
+      <w:pPr>
         <w:rPr>
           <w:color w:val="auto"/>
           <w:lang w:val="fr-FR"/>
@@ -3273,6 +3307,26 @@
           <w:sz w:val="20"/>
         </w:rPr>
         <w:t>Laboratoires Théa, « Notre histoire » — thea.com/fr_WW/page/notre-histoire (année de création : 1994)</w:t>
+      </w:r>
+    </w:p>
+    <w:p>
+      <w:pPr>
+        <w:pStyle w:val="Listepuces"/>
+        <w:numPr>
+          <w:ilvl w:val="0"/>
+          <w:numId w:val="0"/>
+        </w:numPr>
+        <w:ind w:left="360"/>
+        <w:rPr>
+          <w:color w:val="auto"/>
+          <w:lang w:val="fr-FR"/>
+        </w:rPr>
+      </w:pPr>
+      <w:r>
+        <w:rPr>
+          <w:sz w:val="20"/>
+        </w:rPr>
+        <w:t>LEEM, Les Français et leurs médicaments — 100 questions que l’on nous pose, fiche « Le cycle du médicament » (juin 2012).</w:t>
       </w:r>
     </w:p>
     <w:sectPr>

</xml_diff>

<commit_message>
Partie IV : enrichissement de chaque phase depuis la fiche LEEM (details cliniques, EMA/ANSM/HAS, principe actif, selection molecules, generique/post-AMM)
Co-Authored-By: Claude Opus 4.8 <noreply@anthropic.com>
Claude-Session: https://claude.ai/code/session_01DtHWGYnwsC4wUeLa1orSAR
</commit_message>
<xml_diff>
--- a/Rapport_de_stage_Luisa_Guissassa_corrige.docx
+++ b/Rapport_de_stage_Luisa_Guissassa_corrige.docx
@@ -1846,6 +1846,10 @@
         </w:rPr>
         <w:t>.</w:t>
       </w:r>
+      <w:r>
+        <w:rPr/>
+        <w:t xml:space="preserve"> Les axes de recherche sont d’ailleurs orientés par les avancées de la recherche fondamentale (universités, hôpitaux, entreprises), par les besoins médicaux et par la stratégie de l’entreprise.</w:t>
+      </w:r>
     </w:p>
     <w:p>
       <w:pPr>
@@ -2033,6 +2037,10 @@
         </w:rPr>
         <w:t xml:space="preserve"> eu le plus de mal à cerner au début de mon stage.</w:t>
       </w:r>
+      <w:r>
+        <w:rPr/>
+        <w:t xml:space="preserve"> Ce développement industriel se déroule en parallèle des essais cliniques et porte notamment sur la production du principe actif ; avec les résultats des essais, il constitue le dossier de demande d’AMM.</w:t>
+      </w:r>
     </w:p>
     <w:p>
       <w:pPr>
@@ -2120,6 +2128,10 @@
           <w:lang w:val="fr-FR"/>
         </w:rPr>
       </w:r>
+      <w:r>
+        <w:rPr/>
+        <w:t xml:space="preserve"> L’objectif est aussi de sélectionner, parmi de nombreuses molécules, celles qui pourront être testées chez l’homme ; cette étape s’appuie en partie sur des tests sur l’animal.</w:t>
+      </w:r>
     </w:p>
     <w:p>
       <w:pPr>
@@ -2236,6 +2248,10 @@
         </w:rPr>
         <w:t xml:space="preserve"> éthique.</w:t>
       </w:r>
+      <w:r>
+        <w:rPr/>
+        <w:t xml:space="preserve"> Concrètement, une première phase évalue la tolérance sur un nombre limité de volontaires sains, une deuxième l’efficacité chez des patients, et une troisième le rapport efficacité/tolérance sur une population plus large. Ces essais se déroulent le plus souvent en milieu hospitalier.</w:t>
+      </w:r>
     </w:p>
     <w:p>
       <w:pPr>
@@ -2299,6 +2315,10 @@
           <w:lang w:val="fr-FR"/>
         </w:rPr>
       </w:r>
+      <w:r>
+        <w:rPr/>
+        <w:t xml:space="preserve"> Cette autorisation peut suivre une voie européenne (via l’EMA) ou nationale (via l’ANSM). Une fois l’AMM obtenue, le dossier passe encore devant la Commission de la Transparence (HAS), qui évalue le service médical rendu (SMR) et son amélioration (ASMR), avant la fixation du prix et du taux de remboursement.</w:t>
+      </w:r>
     </w:p>
     <w:p>
       <w:pPr>
@@ -2379,6 +2399,10 @@
           <w:lang w:val="fr-FR"/>
         </w:rPr>
         <w:t xml:space="preserve"> dans la durée.</w:t>
+      </w:r>
+      <w:r>
+        <w:rPr/>
+        <w:t xml:space="preserve"> Le médicament est alors fabriqué à l’échelle industrielle, puis distribué en pharmacies, à l’hôpital et auprès des médecins. Au-delà de la pharmacovigilance, il fait l’objet d’études post-AMM. Enfin, à l’expiration du brevet, il peut être commercialisé sous forme de générique, et de nouvelles indications peuvent donner lieu à une nouvelle AMM.</w:t>
       </w:r>
     </w:p>
     <w:p>

</xml_diff>

<commit_message>
Partie IV : perimetre precise (suivi ~6 mois apres 1re mise sur le marche ; reouverture du projet si modifications importantes)
Co-Authored-By: Claude Opus 4.8 <noreply@anthropic.com>
Claude-Session: https://claude.ai/code/session_01DtHWGYnwsC4wUeLa1orSAR
</commit_message>
<xml_diff>
--- a/Rapport_de_stage_Luisa_Guissassa_corrige.docx
+++ b/Rapport_de_stage_Luisa_Guissassa_corrige.docx
@@ -2457,14 +2457,13 @@
           <w:color w:val="auto"/>
           <w:lang w:val="fr-FR"/>
         </w:rPr>
-        <w:t xml:space="preserve">La phase d’idée, tout en amont, n’est pas gérée par la Direction Projet Innovation : le projet n’entre dans le périmètre de l’équipe qu’au moment de l’initiation. C’est à cette étape que les chefs de projet reçoivent leurs premières tâches, et une partie de ces tâches découle directement des phases amont, même si l’équipe ne pilote pas ces phases elle-même. À l’autre extrémité du cycle, le suivi s’arrête à la première mise sur le </w:t>
-      </w:r>
-      <w:r>
-        <w:rPr>
-          <w:color w:val="auto"/>
-          <w:lang w:val="fr-FR"/>
-        </w:rPr>
-        <w:t>marché : les modifications apportées au produit par la suite ne sont pas gérées dans ce cadre. Le périmètre des projets s’étend donc, pour l’essentiel, de l’initiation à la première commercialisation, comme le montre la figure ci-dessus.</w:t>
+        <w:t>La phase d’idée, tout en amont, n’est pas gérée par la Direction Projet Innovation : le projet n’entre dans le périmètre de l’équipe qu’au moment de l’initiation. C’est à cette étape que les chefs de projet reçoivent leurs premières tâches, et une partie de ces tâches découle directement des phases amont, même si l’équipe ne pilote pas ces phases elle-même. À l’autre extrémité du cycle, le suivi assuré par l’équipe se poursuit jusqu’à environ six mois après la première mise sur le marché. Si le médicament fait ensuite l’objet de modifications importantes, l’équipe rouvre alors le projet pour les prendre en charge. Le périmètre des projets s’étend donc, pour l’essentiel, de l’initiation jusqu’à quelques mois après la première commercialisation, comme le montre la figure ci-dessus.</w:t>
+      </w:r>
+      <w:r>
+        <w:rPr>
+          <w:color w:val="auto"/>
+          <w:lang w:val="fr-FR"/>
+        </w:rPr>
       </w:r>
     </w:p>
     <w:p>

</xml_diff>

<commit_message>
Partie Wrike : reecriture directe et concrete de 'La demarche' et 'Le rendu' (etapes claires, ce que je fais)
Co-Authored-By: Claude Opus 4.8 <noreply@anthropic.com>
Claude-Session: https://claude.ai/code/session_01DtHWGYnwsC4wUeLa1orSAR
</commit_message>
<xml_diff>
--- a/Rapport_de_stage_Luisa_Guissassa_corrige.docx
+++ b/Rapport_de_stage_Luisa_Guissassa_corrige.docx
@@ -2705,7 +2705,7 @@
           <w:color w:val="auto"/>
           <w:lang w:val="fr-FR"/>
         </w:rPr>
-        <w:t>Mon travail s’est construit en plusieurs temps. J’ai d’abord pris en main Wrike de manière générale : comprendre son fonctionnement, créer un modèle, partager des dossiers. L’objectif n’était pas seulement de savoir monter un projet, mais d’avoir une vue d’ensemble de l’outil.</w:t>
+        <w:t>D’abord, j’ai pris en main Wrike : créer un modèle, organiser des dossiers, gérer les tâches et les échéances.</w:t>
       </w:r>
     </w:p>
     <w:p>
@@ -2722,14 +2722,13 @@
           <w:color w:val="auto"/>
           <w:lang w:val="fr-FR"/>
         </w:rPr>
-        <w:t xml:space="preserve">J’ai ensuite analysé les procédures internes — celle du médicament, puis celle du dispositif médical, arrivée plus tard, environ deux semaines avant la fin du stage. </w:t>
-      </w:r>
-      <w:r>
-        <w:rPr>
-          <w:color w:val="auto"/>
-          <w:lang w:val="fr-FR"/>
-        </w:rPr>
-        <w:t>Cette analyse m’a permis de dégager les grandes lignes que les modèles devaient suivre.</w:t>
+        <w:t>Ensuite, j’ai analysé les procédures internes (médicament, puis dispositif médical) pour repérer les étapes à intégrer aux modèles.</w:t>
+      </w:r>
+      <w:r>
+        <w:rPr>
+          <w:color w:val="auto"/>
+          <w:lang w:val="fr-FR"/>
+        </w:rPr>
       </w:r>
     </w:p>
     <w:p>
@@ -2746,7 +2745,7 @@
           <w:color w:val="auto"/>
           <w:lang w:val="fr-FR"/>
         </w:rPr>
-        <w:t>Je suis alors entrée dans le concret. J’ai d’abord récupéré la liste des tâches du développement et je l’ai retranscrite dans Wrike, puis j’ai fait de même avec celle des affaires cliniques. Une fois ces tâches en place, je suis revenue vers les deux départements pour relier les tâches entre elles : comprendre à quoi les anciennes tâches correspondaient dans leurs nouvelles listes, voir comment ils regroupaient certaines activités pour gagner en efficacité, et repérer les doublons. Ces échanges prenaient surtout la forme de réunions. Avec le département CMC, par exemple, j’ai eu deux entretiens en tête-à-tête ; d’autres se faisaient en équipe, lors de réunions avec le référent du département concerné. Des discussions plus informelles m’ont également aidée à orienter l’organisation dans Wrike. En parallèle, un point hebdomadaire, en début de semaine, permettait de faire le bilan de mon avancement et de cadrer le travail à venir.</w:t>
+        <w:t>Puis j’ai récupéré les listes de tâches de chaque service — le développement, puis les affaires cliniques — et je les ai saisies dans Wrike, en tâches et sous-tâches, regroupées par département.</w:t>
       </w:r>
     </w:p>
     <w:p>
@@ -2763,7 +2762,41 @@
           <w:color w:val="auto"/>
           <w:lang w:val="fr-FR"/>
         </w:rPr>
-        <w:t>La mise en place dans Wrike supposait aussi de respecter l’enchaînement des tâches — leurs prédécesseurs et leurs successeurs — pour conserver l’ordre logique du projet. Le modèle rassemble d’ailleurs l’ensemble des activités du projet, portées par les différentes fonctions, et pas seulement celles du chef de projet. Enfin, j’ai cherché à harmoniser le tout pour que chaque département retrouve clairement sa liste de tâches, sans que les activités se mélangent : certaines figuraient au mauvais endroit, et je les ai réattribuées au bon service, tout en restant fidèle à la procédure.</w:t>
+        <w:t>J’ai ensuite relié les tâches entre elles (prédécesseurs et successeurs) pour respecter l’ordre réel du projet, en validant les enchaînements avec chaque service.</w:t>
+      </w:r>
+    </w:p>
+    <w:p>
+      <w:pPr>
+        <w:pStyle w:val="Paragraphedeliste"/>
+        <w:ind w:left="1440"/>
+        <w:rPr>
+          <w:color w:val="auto"/>
+          <w:lang w:val="fr-FR"/>
+        </w:rPr>
+      </w:pPr>
+      <w:r>
+        <w:rPr>
+          <w:color w:val="auto"/>
+          <w:lang w:val="fr-FR"/>
+        </w:rPr>
+        <w:t>Enfin, j’ai supprimé les doublons et réattribué au bon service les tâches mal classées — par exemple une tâche notée en clinique mais réalisée par le réglementaire.</w:t>
+      </w:r>
+    </w:p>
+    <w:p>
+      <w:pPr>
+        <w:pStyle w:val="Paragraphedeliste"/>
+        <w:ind w:left="1440"/>
+        <w:rPr>
+          <w:color w:val="auto"/>
+          <w:lang w:val="fr-FR"/>
+        </w:rPr>
+      </w:pPr>
+      <w:r>
+        <w:rPr>
+          <w:color w:val="auto"/>
+          <w:lang w:val="fr-FR"/>
+        </w:rPr>
+        <w:t>Ces échanges se faisaient surtout en réunion (dont deux points en tête-à-tête avec le développement), avec un point hebdomadaire pour suivre mon avancement.</w:t>
       </w:r>
     </w:p>
     <w:p>
@@ -2819,7 +2852,7 @@
           <w:color w:val="auto"/>
           <w:lang w:val="fr-FR"/>
         </w:rPr>
-        <w:t>Le rendu final se compose de deux modèles de projet distincts dans Wrike : un pour les projets de type médicament et un pour les projets de type dispositif médical. Tous deux suivent la même logique d’organisation, par service.</w:t>
+        <w:t>Le rendu final, ce sont deux modèles de projet dans Wrike : un pour les médicaments, un pour les dispositifs médicaux.</w:t>
       </w:r>
     </w:p>
     <w:p>
@@ -2836,7 +2869,7 @@
           <w:color w:val="auto"/>
           <w:lang w:val="fr-FR"/>
         </w:rPr>
-        <w:t>Dans le détail, chaque modèle présente un projet de la façon suivante : sous le nom du projet, une section par département ; à l’intérieur de chaque section, les tâches et leurs sous-tâches, organisées selon le fonctionnement propre au département. Les départements couverts sont le développement, les affaires cliniques, le réglementaire et le lancement.</w:t>
+        <w:t>Dans chaque modèle, le projet est organisé par service : une section par département, contenant ses tâches et ses sous-tâches, dans l’ordre du projet. Les départements couverts sont le développement, les affaires cliniques, le réglementaire et le lancement.</w:t>
       </w:r>
     </w:p>
     <w:p>
@@ -2853,7 +2886,7 @@
           <w:color w:val="auto"/>
           <w:lang w:val="fr-FR"/>
         </w:rPr>
-        <w:t>J’ai repris la majeure partie de l’existant et y ai intégré les listes de tâches mises à jour, en particulier celles des affaires cliniques et du développement. Dans le modèle médicament, par exemple, j’ai ajouté les nouvelles tâches liées à la gestion de projet, au développement, aux affaires cliniques et au lancement (marketing).</w:t>
+        <w:t>J’y ai intégré les listes de tâches mises à jour, en particulier celles des affaires cliniques et du développement.</w:t>
       </w:r>
     </w:p>
     <w:p>
@@ -2870,7 +2903,7 @@
           <w:color w:val="auto"/>
           <w:lang w:val="fr-FR"/>
         </w:rPr>
-        <w:t>À ce stade, la partie clinique constitue déjà une base solide, qui reflète bien l’activité du service. Les modèles restent toutefois incomplets : certaines liaisons entre tâches — c’est-à-dire l’identification des prédécesseurs et des successeurs — sont encore à établir, et de nombreux doublons restent à trancher, ce qui rend la partie développement particulièrement complexe. Ce travail constitue donc une première base, et non un modèle définitif : il a fait l’objet de nombreuses discussions avec ma tutrice et les chefs de projet concernés, et d’autres personnes de l’équipe poursuivront dessus pour l’affiner et, à terme, le déployer auprès de l’ensemble des chefs de projet.</w:t>
+        <w:t>En l’état, c’est une première base : la partie clinique est solide, tandis que le développement et le lancement restent à affiner (liaisons entre tâches et doublons à traiter). Le modèle sera ensuite repris par l’équipe pour être finalisé, puis déployé auprès des chefs de projet.</w:t>
       </w:r>
     </w:p>
     <w:p>

</xml_diff>

<commit_message>
Partie IV : CMC reformule (formulation definie au pre-projet chez Thea) + generation d'une version .md lisible du rapport
Co-Authored-By: Claude Opus 4.8 <noreply@anthropic.com>
Claude-Session: https://claude.ai/code/session_01DtHWGYnwsC4wUeLa1orSAR
</commit_message>
<xml_diff>
--- a/Rapport_de_stage_Luisa_Guissassa_corrige.docx
+++ b/Rapport_de_stage_Luisa_Guissassa_corrige.docx
@@ -1850,6 +1850,10 @@
         <w:rPr/>
         <w:t xml:space="preserve"> Les axes de recherche sont d’ailleurs orientés par les avancées de la recherche fondamentale (universités, hôpitaux, entreprises), par les besoins médicaux et par la stratégie de l’entreprise.</w:t>
       </w:r>
+      <w:r>
+        <w:rPr/>
+        <w:t xml:space="preserve"> Chez Théa, c’est aussi à ce stade que sont définies, pour l’essentiel, la formulation galénique du produit — la façon de transformer le principe actif en médicament administrable — et les grandes lignes de son procédé de fabrication.</w:t>
+      </w:r>
     </w:p>
     <w:p>
       <w:pPr>
@@ -1978,68 +1982,58 @@
           <w:color w:val="auto"/>
           <w:lang w:val="fr-FR"/>
         </w:rPr>
-        <w:lastRenderedPageBreak/>
-        <w:t xml:space="preserve">Le développement CMC (Chimie, Fabrication et Contrôles) sert à définir et à stabiliser </w:t>
-      </w:r>
-      <w:r>
-        <w:rPr>
-          <w:color w:val="auto"/>
-          <w:lang w:val="fr-FR"/>
-        </w:rPr>
-        <w:t>tout ce</w:t>
-      </w:r>
-      <w:r>
-        <w:rPr>
-          <w:color w:val="auto"/>
-          <w:lang w:val="fr-FR"/>
-        </w:rPr>
-        <w:t xml:space="preserve"> qui touche à la fabrication du produit : son procédé de fabrication et </w:t>
-      </w:r>
-      <w:r>
-        <w:rPr>
-          <w:color w:val="auto"/>
-          <w:lang w:val="fr-FR"/>
-        </w:rPr>
-        <w:t>les méthodes</w:t>
-      </w:r>
-      <w:r>
-        <w:rPr>
-          <w:color w:val="auto"/>
-          <w:lang w:val="fr-FR"/>
-        </w:rPr>
-        <w:t xml:space="preserve"> qui garantissent sa qualité et sa reproductibilité dans le temps. Ce </w:t>
-      </w:r>
-      <w:r>
-        <w:rPr>
-          <w:color w:val="auto"/>
-          <w:lang w:val="fr-FR"/>
-        </w:rPr>
-        <w:t>travail démarre</w:t>
-      </w:r>
-      <w:r>
-        <w:rPr>
-          <w:color w:val="auto"/>
-          <w:lang w:val="fr-FR"/>
-        </w:rPr>
-        <w:t xml:space="preserve"> tôt et se poursuit en parallèle des étapes suivantes. C’est la partie du cycle </w:t>
-      </w:r>
-      <w:r>
-        <w:rPr>
-          <w:color w:val="auto"/>
-          <w:lang w:val="fr-FR"/>
-        </w:rPr>
-        <w:t>que j’ai</w:t>
-      </w:r>
-      <w:r>
-        <w:rPr>
-          <w:color w:val="auto"/>
-          <w:lang w:val="fr-FR"/>
-        </w:rPr>
-        <w:t xml:space="preserve"> eu le plus de mal à cerner au début de mon stage.</w:t>
+        <w:t>Le développement CMC (Chimie, Fabrication et Contrôles) correspond à la partie « qualité » du développement. Il vise à définir et à stabiliser tout ce qui touche à la fabrication du produit : la production du principe actif, le procédé de fabrication et les méthodes de contrôle qui garantissent la qualité et la reproductibilité du produit dans le temps. Chez Théa, il n’intègre pas la formulation : la formulation galénique et les grandes lignes du procédé de fabrication sont en effet définies plus en amont, dès le pré-projet. Ce travail démarre tôt et se poursuit en parallèle des essais cliniques ; avec leurs résultats, il contribue à constituer le dossier de demande d’AMM. C’est la partie du cycle que j’ai eu le plus de mal à cerner au début de mon stage.</w:t>
+      </w:r>
+      <w:r>
+        <w:rPr>
+          <w:color w:val="auto"/>
+          <w:lang w:val="fr-FR"/>
+        </w:rPr>
+      </w:r>
+      <w:r>
+        <w:rPr>
+          <w:color w:val="auto"/>
+          <w:lang w:val="fr-FR"/>
+        </w:rPr>
+      </w:r>
+      <w:r>
+        <w:rPr>
+          <w:color w:val="auto"/>
+          <w:lang w:val="fr-FR"/>
+        </w:rPr>
+      </w:r>
+      <w:r>
+        <w:rPr>
+          <w:color w:val="auto"/>
+          <w:lang w:val="fr-FR"/>
+        </w:rPr>
+      </w:r>
+      <w:r>
+        <w:rPr>
+          <w:color w:val="auto"/>
+          <w:lang w:val="fr-FR"/>
+        </w:rPr>
+      </w:r>
+      <w:r>
+        <w:rPr>
+          <w:color w:val="auto"/>
+          <w:lang w:val="fr-FR"/>
+        </w:rPr>
+      </w:r>
+      <w:r>
+        <w:rPr>
+          <w:color w:val="auto"/>
+          <w:lang w:val="fr-FR"/>
+        </w:rPr>
+      </w:r>
+      <w:r>
+        <w:rPr>
+          <w:color w:val="auto"/>
+          <w:lang w:val="fr-FR"/>
+        </w:rPr>
       </w:r>
       <w:r>
         <w:rPr/>
-        <w:t xml:space="preserve"> Ce développement industriel se déroule en parallèle des essais cliniques et porte notamment sur la production du principe actif ; avec les résultats des essais, il constitue le dossier de demande d’AMM.</w:t>
       </w:r>
     </w:p>
     <w:p>

</xml_diff>